<commit_message>
Add MIT license, version table, references; re-run evaluation on final code
- MIT license (LICENSE, pyproject metadata, README section)
- README: tested versions (Python, Ollama, model digest, packages),
  `init` in the command reference, link to the schema
- Design doc and report: references and evidence-index appendices;
  timing numbers from the new run
- Evaluation harness now runs with a clean environment and ignores .env
  (CK_IGNORE_DOTENV), so personal mail settings can never reach results/
- Sample-mail generator uses a fixed MIME boundary, so regenerated
  fixtures are byte-identical
- Results regenerated on the final code: 12/12 scenarios, memory on 3/3
  vs off 0/3, 5/5 sampled claims, 0 duplicate deliveries

Co-Authored-By: Claude Opus 5.5 <noreply@anthropic.com>
</commit_message>
<xml_diff>
--- a/docs/report/CommitKeeper_Technical_Report_I22-0395.docx
+++ b/docs/report/CommitKeeper_Technical_Report_I22-0395.docx
@@ -3827,7 +3827,7 @@
                 <w:sz w:val="17"/>
                 <w:szCs w:val="17"/>
               </w:rPr>
-              <w:t xml:space="preserve">44.6 s</w:t>
+              <w:t xml:space="preserve">44.9 s</w:t>
             </w:r>
           </w:p>
         </w:tc>
@@ -3853,7 +3853,7 @@
                 <w:sz w:val="17"/>
                 <w:szCs w:val="17"/>
               </w:rPr>
-              <w:t xml:space="preserve">5,228 / 2,429</w:t>
+              <w:t xml:space="preserve">5,228 / 2,316</w:t>
             </w:r>
           </w:p>
         </w:tc>
@@ -3879,7 +3879,7 @@
                 <w:sz w:val="17"/>
                 <w:szCs w:val="17"/>
               </w:rPr>
-              <w:t xml:space="preserve">46.4 s</w:t>
+              <w:t xml:space="preserve">47.5 s</w:t>
             </w:r>
           </w:p>
         </w:tc>
@@ -3959,7 +3959,7 @@
                 <w:sz w:val="17"/>
                 <w:szCs w:val="17"/>
               </w:rPr>
-              <w:t xml:space="preserve">38.7 s</w:t>
+              <w:t xml:space="preserve">45.1 s</w:t>
             </w:r>
           </w:p>
         </w:tc>
@@ -3985,7 +3985,7 @@
                 <w:sz w:val="17"/>
                 <w:szCs w:val="17"/>
               </w:rPr>
-              <w:t xml:space="preserve">6,012 / 2,116</w:t>
+              <w:t xml:space="preserve">6,012 / 2,480</w:t>
             </w:r>
           </w:p>
         </w:tc>
@@ -4011,7 +4011,7 @@
                 <w:sz w:val="17"/>
                 <w:szCs w:val="17"/>
               </w:rPr>
-              <w:t xml:space="preserve">40.5 s</w:t>
+              <w:t xml:space="preserve">47.8 s</w:t>
             </w:r>
           </w:p>
         </w:tc>
@@ -4091,7 +4091,7 @@
                 <w:sz w:val="17"/>
                 <w:szCs w:val="17"/>
               </w:rPr>
-              <w:t xml:space="preserve">24.8 s</w:t>
+              <w:t xml:space="preserve">28.6 s</w:t>
             </w:r>
           </w:p>
         </w:tc>
@@ -4117,7 +4117,7 @@
                 <w:sz w:val="17"/>
                 <w:szCs w:val="17"/>
               </w:rPr>
-              <w:t xml:space="preserve">4,682 / 1,337</w:t>
+              <w:t xml:space="preserve">4,682 / 1,591</w:t>
             </w:r>
           </w:p>
         </w:tc>
@@ -4143,7 +4143,7 @@
                 <w:sz w:val="17"/>
                 <w:szCs w:val="17"/>
               </w:rPr>
-              <w:t xml:space="preserve">26.4 s</w:t>
+              <w:t xml:space="preserve">30.1 s</w:t>
             </w:r>
           </w:p>
         </w:tc>
@@ -4223,7 +4223,7 @@
                 <w:sz w:val="17"/>
                 <w:szCs w:val="17"/>
               </w:rPr>
-              <w:t xml:space="preserve">44.1 s</w:t>
+              <w:t xml:space="preserve">60.8 s</w:t>
             </w:r>
           </w:p>
         </w:tc>
@@ -4249,7 +4249,7 @@
                 <w:sz w:val="17"/>
                 <w:szCs w:val="17"/>
               </w:rPr>
-              <w:t xml:space="preserve">4,089 / 2,433</w:t>
+              <w:t xml:space="preserve">4,089 / 3,389</w:t>
             </w:r>
           </w:p>
         </w:tc>
@@ -4275,7 +4275,7 @@
                 <w:sz w:val="17"/>
                 <w:szCs w:val="17"/>
               </w:rPr>
-              <w:t xml:space="preserve">45.5 s</w:t>
+              <w:t xml:space="preserve">62.1 s</w:t>
             </w:r>
           </w:p>
         </w:tc>
@@ -4296,7 +4296,7 @@
           <w:sz w:val="21"/>
           <w:szCs w:val="21"/>
         </w:rPr>
-        <w:t xml:space="preserve">Extraction calls take about 2 s; reasoning decisions take 10–25 s. Commitments that need no attention are decided by rule, so model calls scale with what changed rather than with the size of the register.</w:t>
+        <w:t xml:space="preserve">Extraction calls take about 2 s; reasoning decisions take 10–30 s. Commitments that need no attention are decided by rule, so model calls scale with what changed rather than with the size of the register.</w:t>
       </w:r>
     </w:p>
     <w:p>
@@ -5967,7 +5967,888 @@
           <w:sz w:val="28"/>
           <w:szCs w:val="28"/>
         </w:rPr>
-        <w:t xml:space="preserve">Appendix: AI assistance and external code</w:t>
+        <w:t xml:space="preserve">Appendix A: References</w:t>
+      </w:r>
+    </w:p>
+    <w:p>
+      <w:pPr>
+        <w:pStyle w:val="ListParagraph"/>
+        <w:numPr>
+          <w:ilvl w:val="0"/>
+          <w:numId w:val="5"/>
+        </w:numPr>
+        <w:spacing w:after="60" w:line="264"/>
+      </w:pPr>
+      <w:r>
+        <w:rPr>
+          <w:rFonts w:ascii="Calibri" w:cs="Calibri" w:eastAsia="Calibri" w:hAnsi="Calibri"/>
+          <w:sz w:val="21"/>
+          <w:szCs w:val="21"/>
+        </w:rPr>
+        <w:t xml:space="preserve">Qwen Team (2025). </w:t>
+      </w:r>
+      <w:r>
+        <w:rPr>
+          <w:rFonts w:ascii="Calibri" w:cs="Calibri" w:eastAsia="Calibri" w:hAnsi="Calibri"/>
+          <w:i/>
+          <w:iCs/>
+          <w:sz w:val="21"/>
+          <w:szCs w:val="21"/>
+        </w:rPr>
+        <w:t xml:space="preserve">Qwen3 Technical Report.</w:t>
+      </w:r>
+      <w:r>
+        <w:rPr>
+          <w:rFonts w:ascii="Calibri" w:cs="Calibri" w:eastAsia="Calibri" w:hAnsi="Calibri"/>
+          <w:sz w:val="21"/>
+          <w:szCs w:val="21"/>
+        </w:rPr>
+        <w:t xml:space="preserve"> arXiv:2505.09388.</w:t>
+      </w:r>
+    </w:p>
+    <w:p>
+      <w:pPr>
+        <w:pStyle w:val="ListParagraph"/>
+        <w:numPr>
+          <w:ilvl w:val="0"/>
+          <w:numId w:val="5"/>
+        </w:numPr>
+        <w:spacing w:after="60" w:line="264"/>
+      </w:pPr>
+      <w:r>
+        <w:rPr>
+          <w:rFonts w:ascii="Calibri" w:cs="Calibri" w:eastAsia="Calibri" w:hAnsi="Calibri"/>
+          <w:sz w:val="21"/>
+          <w:szCs w:val="21"/>
+        </w:rPr>
+        <w:t xml:space="preserve">Ollama. </w:t>
+      </w:r>
+      <w:r>
+        <w:rPr>
+          <w:rFonts w:ascii="Calibri" w:cs="Calibri" w:eastAsia="Calibri" w:hAnsi="Calibri"/>
+          <w:i/>
+          <w:iCs/>
+          <w:sz w:val="21"/>
+          <w:szCs w:val="21"/>
+        </w:rPr>
+        <w:t xml:space="preserve">API reference: chat endpoint, structured outputs (</w:t>
+      </w:r>
+      <w:r>
+        <w:rPr>
+          <w:rFonts w:ascii="Consolas" w:cs="Consolas" w:eastAsia="Consolas" w:hAnsi="Consolas"/>
+          <w:color w:val="333333"/>
+          <w:sz w:val="19"/>
+          <w:szCs w:val="19"/>
+        </w:rPr>
+        <w:t xml:space="preserve">format</w:t>
+      </w:r>
+      <w:r>
+        <w:rPr>
+          <w:rFonts w:ascii="Calibri" w:cs="Calibri" w:eastAsia="Calibri" w:hAnsi="Calibri"/>
+          <w:i/>
+          <w:iCs/>
+          <w:sz w:val="21"/>
+          <w:szCs w:val="21"/>
+        </w:rPr>
+        <w:t xml:space="preserve"> JSON schema) and thinking.</w:t>
+      </w:r>
+      <w:r>
+        <w:rPr>
+          <w:rFonts w:ascii="Calibri" w:cs="Calibri" w:eastAsia="Calibri" w:hAnsi="Calibri"/>
+          <w:sz w:val="21"/>
+          <w:szCs w:val="21"/>
+        </w:rPr>
+        <w:t xml:space="preserve"> https://github.com/ollama/ollama/blob/main/docs/api.md</w:t>
+      </w:r>
+    </w:p>
+    <w:p>
+      <w:pPr>
+        <w:pStyle w:val="ListParagraph"/>
+        <w:numPr>
+          <w:ilvl w:val="0"/>
+          <w:numId w:val="5"/>
+        </w:numPr>
+        <w:spacing w:after="60" w:line="264"/>
+      </w:pPr>
+      <w:r>
+        <w:rPr>
+          <w:rFonts w:ascii="Calibri" w:cs="Calibri" w:eastAsia="Calibri" w:hAnsi="Calibri"/>
+          <w:sz w:val="21"/>
+          <w:szCs w:val="21"/>
+        </w:rPr>
+        <w:t xml:space="preserve">Crispin, M. (2003). </w:t>
+      </w:r>
+      <w:r>
+        <w:rPr>
+          <w:rFonts w:ascii="Calibri" w:cs="Calibri" w:eastAsia="Calibri" w:hAnsi="Calibri"/>
+          <w:i/>
+          <w:iCs/>
+          <w:sz w:val="21"/>
+          <w:szCs w:val="21"/>
+        </w:rPr>
+        <w:t xml:space="preserve">RFC 3501: Internet Message Access Protocol, Version 4rev1.</w:t>
+      </w:r>
+      <w:r>
+        <w:rPr>
+          <w:rFonts w:ascii="Calibri" w:cs="Calibri" w:eastAsia="Calibri" w:hAnsi="Calibri"/>
+          <w:sz w:val="21"/>
+          <w:szCs w:val="21"/>
+        </w:rPr>
+        <w:t xml:space="preserve"> IETF.</w:t>
+      </w:r>
+    </w:p>
+    <w:p>
+      <w:pPr>
+        <w:pStyle w:val="ListParagraph"/>
+        <w:numPr>
+          <w:ilvl w:val="0"/>
+          <w:numId w:val="5"/>
+        </w:numPr>
+        <w:spacing w:after="60" w:line="264"/>
+      </w:pPr>
+      <w:r>
+        <w:rPr>
+          <w:rFonts w:ascii="Calibri" w:cs="Calibri" w:eastAsia="Calibri" w:hAnsi="Calibri"/>
+          <w:sz w:val="21"/>
+          <w:szCs w:val="21"/>
+        </w:rPr>
+        <w:t xml:space="preserve">Klensin, J. (2008). </w:t>
+      </w:r>
+      <w:r>
+        <w:rPr>
+          <w:rFonts w:ascii="Calibri" w:cs="Calibri" w:eastAsia="Calibri" w:hAnsi="Calibri"/>
+          <w:i/>
+          <w:iCs/>
+          <w:sz w:val="21"/>
+          <w:szCs w:val="21"/>
+        </w:rPr>
+        <w:t xml:space="preserve">RFC 5321: Simple Mail Transfer Protocol.</w:t>
+      </w:r>
+      <w:r>
+        <w:rPr>
+          <w:rFonts w:ascii="Calibri" w:cs="Calibri" w:eastAsia="Calibri" w:hAnsi="Calibri"/>
+          <w:sz w:val="21"/>
+          <w:szCs w:val="21"/>
+        </w:rPr>
+        <w:t xml:space="preserve"> IETF.</w:t>
+      </w:r>
+    </w:p>
+    <w:p>
+      <w:pPr>
+        <w:pStyle w:val="ListParagraph"/>
+        <w:numPr>
+          <w:ilvl w:val="0"/>
+          <w:numId w:val="5"/>
+        </w:numPr>
+        <w:spacing w:after="60" w:line="264"/>
+      </w:pPr>
+      <w:r>
+        <w:rPr>
+          <w:rFonts w:ascii="Calibri" w:cs="Calibri" w:eastAsia="Calibri" w:hAnsi="Calibri"/>
+          <w:sz w:val="21"/>
+          <w:szCs w:val="21"/>
+        </w:rPr>
+        <w:t xml:space="preserve">Desruisseaux, B. (2009). </w:t>
+      </w:r>
+      <w:r>
+        <w:rPr>
+          <w:rFonts w:ascii="Calibri" w:cs="Calibri" w:eastAsia="Calibri" w:hAnsi="Calibri"/>
+          <w:i/>
+          <w:iCs/>
+          <w:sz w:val="21"/>
+          <w:szCs w:val="21"/>
+        </w:rPr>
+        <w:t xml:space="preserve">RFC 5545: Internet Calendaring and Scheduling Core Object Specification (iCalendar).</w:t>
+      </w:r>
+      <w:r>
+        <w:rPr>
+          <w:rFonts w:ascii="Calibri" w:cs="Calibri" w:eastAsia="Calibri" w:hAnsi="Calibri"/>
+          <w:sz w:val="21"/>
+          <w:szCs w:val="21"/>
+        </w:rPr>
+        <w:t xml:space="preserve"> IETF.</w:t>
+      </w:r>
+    </w:p>
+    <w:p>
+      <w:pPr>
+        <w:pStyle w:val="ListParagraph"/>
+        <w:numPr>
+          <w:ilvl w:val="0"/>
+          <w:numId w:val="5"/>
+        </w:numPr>
+        <w:spacing w:after="60" w:line="264"/>
+      </w:pPr>
+      <w:r>
+        <w:rPr>
+          <w:rFonts w:ascii="Calibri" w:cs="Calibri" w:eastAsia="Calibri" w:hAnsi="Calibri"/>
+          <w:sz w:val="21"/>
+          <w:szCs w:val="21"/>
+        </w:rPr>
+        <w:t xml:space="preserve">OWASP (2025). </w:t>
+      </w:r>
+      <w:r>
+        <w:rPr>
+          <w:rFonts w:ascii="Calibri" w:cs="Calibri" w:eastAsia="Calibri" w:hAnsi="Calibri"/>
+          <w:i/>
+          <w:iCs/>
+          <w:sz w:val="21"/>
+          <w:szCs w:val="21"/>
+        </w:rPr>
+        <w:t xml:space="preserve">Top 10 for Large Language Model Applications: LLM01 Prompt Injection.</w:t>
+      </w:r>
+      <w:r>
+        <w:rPr>
+          <w:rFonts w:ascii="Calibri" w:cs="Calibri" w:eastAsia="Calibri" w:hAnsi="Calibri"/>
+          <w:sz w:val="21"/>
+          <w:szCs w:val="21"/>
+        </w:rPr>
+        <w:t xml:space="preserve"> https://genai.owasp.org/llm-top-10/</w:t>
+      </w:r>
+    </w:p>
+    <w:p>
+      <w:pPr>
+        <w:pStyle w:val="ListParagraph"/>
+        <w:numPr>
+          <w:ilvl w:val="0"/>
+          <w:numId w:val="5"/>
+        </w:numPr>
+        <w:spacing w:after="60" w:line="264"/>
+      </w:pPr>
+      <w:r>
+        <w:rPr>
+          <w:rFonts w:ascii="Calibri" w:cs="Calibri" w:eastAsia="Calibri" w:hAnsi="Calibri"/>
+          <w:sz w:val="21"/>
+          <w:szCs w:val="21"/>
+        </w:rPr>
+        <w:t xml:space="preserve">Yao, S. et al. (2023). </w:t>
+      </w:r>
+      <w:r>
+        <w:rPr>
+          <w:rFonts w:ascii="Calibri" w:cs="Calibri" w:eastAsia="Calibri" w:hAnsi="Calibri"/>
+          <w:i/>
+          <w:iCs/>
+          <w:sz w:val="21"/>
+          <w:szCs w:val="21"/>
+        </w:rPr>
+        <w:t xml:space="preserve">ReAct: Synergizing Reasoning and Acting in Language Models.</w:t>
+      </w:r>
+      <w:r>
+        <w:rPr>
+          <w:rFonts w:ascii="Calibri" w:cs="Calibri" w:eastAsia="Calibri" w:hAnsi="Calibri"/>
+          <w:sz w:val="21"/>
+          <w:szCs w:val="21"/>
+        </w:rPr>
+        <w:t xml:space="preserve"> ICLR 2023.</w:t>
+      </w:r>
+    </w:p>
+    <w:p>
+      <w:pPr>
+        <w:pStyle w:val="ListParagraph"/>
+        <w:numPr>
+          <w:ilvl w:val="0"/>
+          <w:numId w:val="5"/>
+        </w:numPr>
+        <w:spacing w:after="60" w:line="264"/>
+      </w:pPr>
+      <w:r>
+        <w:rPr>
+          <w:rFonts w:ascii="Calibri" w:cs="Calibri" w:eastAsia="Calibri" w:hAnsi="Calibri"/>
+          <w:sz w:val="21"/>
+          <w:szCs w:val="21"/>
+        </w:rPr>
+        <w:t xml:space="preserve">Packer, C. et al. (2023). </w:t>
+      </w:r>
+      <w:r>
+        <w:rPr>
+          <w:rFonts w:ascii="Calibri" w:cs="Calibri" w:eastAsia="Calibri" w:hAnsi="Calibri"/>
+          <w:i/>
+          <w:iCs/>
+          <w:sz w:val="21"/>
+          <w:szCs w:val="21"/>
+        </w:rPr>
+        <w:t xml:space="preserve">MemGPT: Towards LLMs as Operating Systems.</w:t>
+      </w:r>
+      <w:r>
+        <w:rPr>
+          <w:rFonts w:ascii="Calibri" w:cs="Calibri" w:eastAsia="Calibri" w:hAnsi="Calibri"/>
+          <w:sz w:val="21"/>
+          <w:szCs w:val="21"/>
+        </w:rPr>
+        <w:t xml:space="preserve"> arXiv:2310.08560.</w:t>
+      </w:r>
+    </w:p>
+    <w:p>
+      <w:pPr>
+        <w:pStyle w:val="Heading1"/>
+      </w:pPr>
+      <w:r>
+        <w:rPr>
+          <w:rFonts w:ascii="Calibri" w:cs="Calibri" w:eastAsia="Calibri" w:hAnsi="Calibri"/>
+          <w:b/>
+          <w:bCs/>
+          <w:color w:val="1F3864"/>
+          <w:sz w:val="28"/>
+          <w:szCs w:val="28"/>
+        </w:rPr>
+        <w:t xml:space="preserve">Appendix B: Evidence index</w:t>
+      </w:r>
+    </w:p>
+    <w:tbl>
+      <w:tblPr>
+        <w:tblW w:type="dxa" w:w="9746"/>
+        <w:tblBorders>
+          <w:top w:val="single" w:color="BFBFBF" w:sz="4"/>
+          <w:left w:val="single" w:color="BFBFBF" w:sz="4"/>
+          <w:bottom w:val="single" w:color="BFBFBF" w:sz="4"/>
+          <w:right w:val="single" w:color="BFBFBF" w:sz="4"/>
+          <w:insideH w:val="single" w:color="BFBFBF" w:sz="4"/>
+          <w:insideV w:val="single" w:color="BFBFBF" w:sz="4"/>
+        </w:tblBorders>
+        <w:tblLayout w:type="fixed"/>
+      </w:tblPr>
+      <w:tblGrid>
+        <w:gridCol w:w="4643"/>
+        <w:gridCol w:w="5103"/>
+      </w:tblGrid>
+      <w:tr>
+        <w:trPr>
+          <w:tblHeader/>
+        </w:trPr>
+        <w:tc>
+          <w:tcPr>
+            <w:tcW w:type="dxa" w:w="4643"/>
+            <w:shd w:fill="1F3864" w:color="auto" w:val="clear"/>
+            <w:tcMar>
+              <w:top w:type="dxa" w:w="50"/>
+              <w:left w:type="dxa" w:w="80"/>
+              <w:bottom w:type="dxa" w:w="50"/>
+              <w:right w:type="dxa" w:w="80"/>
+            </w:tcMar>
+          </w:tcPr>
+          <w:p>
+            <w:pPr>
+              <w:spacing w:after="0" w:line="240"/>
+            </w:pPr>
+            <w:r>
+              <w:rPr>
+                <w:rFonts w:ascii="Calibri" w:cs="Calibri" w:eastAsia="Calibri" w:hAnsi="Calibri"/>
+                <w:b/>
+                <w:bCs/>
+                <w:color w:val="FFFFFF"/>
+                <w:sz w:val="17"/>
+                <w:szCs w:val="17"/>
+              </w:rPr>
+              <w:t xml:space="preserve">Evidence</w:t>
+            </w:r>
+          </w:p>
+        </w:tc>
+        <w:tc>
+          <w:tcPr>
+            <w:tcW w:type="dxa" w:w="5103"/>
+            <w:shd w:fill="1F3864" w:color="auto" w:val="clear"/>
+            <w:tcMar>
+              <w:top w:type="dxa" w:w="50"/>
+              <w:left w:type="dxa" w:w="80"/>
+              <w:bottom w:type="dxa" w:w="50"/>
+              <w:right w:type="dxa" w:w="80"/>
+            </w:tcMar>
+          </w:tcPr>
+          <w:p>
+            <w:pPr>
+              <w:spacing w:after="0" w:line="240"/>
+            </w:pPr>
+            <w:r>
+              <w:rPr>
+                <w:rFonts w:ascii="Calibri" w:cs="Calibri" w:eastAsia="Calibri" w:hAnsi="Calibri"/>
+                <w:b/>
+                <w:bCs/>
+                <w:color w:val="FFFFFF"/>
+                <w:sz w:val="17"/>
+                <w:szCs w:val="17"/>
+              </w:rPr>
+              <w:t xml:space="preserve">File</w:t>
+            </w:r>
+          </w:p>
+        </w:tc>
+      </w:tr>
+      <w:tr>
+        <w:tc>
+          <w:tcPr>
+            <w:tcW w:type="dxa" w:w="4643"/>
+            <w:tcMar>
+              <w:top w:type="dxa" w:w="50"/>
+              <w:left w:type="dxa" w:w="80"/>
+              <w:bottom w:type="dxa" w:w="50"/>
+              <w:right w:type="dxa" w:w="80"/>
+            </w:tcMar>
+          </w:tcPr>
+          <w:p>
+            <w:pPr>
+              <w:spacing w:after="0" w:line="240"/>
+            </w:pPr>
+            <w:r>
+              <w:rPr>
+                <w:rFonts w:ascii="Calibri" w:cs="Calibri" w:eastAsia="Calibri" w:hAnsi="Calibri"/>
+                <w:b w:val="false"/>
+                <w:bCs w:val="false"/>
+                <w:sz w:val="17"/>
+                <w:szCs w:val="17"/>
+              </w:rPr>
+              <w:t xml:space="preserve">Scenario table (input, saved state, expected, observed, result, evidence), memory comparison, sampled claims, duplicates, model usage</w:t>
+            </w:r>
+          </w:p>
+        </w:tc>
+        <w:tc>
+          <w:tcPr>
+            <w:tcW w:type="dxa" w:w="5103"/>
+            <w:tcMar>
+              <w:top w:type="dxa" w:w="50"/>
+              <w:left w:type="dxa" w:w="80"/>
+              <w:bottom w:type="dxa" w:w="50"/>
+              <w:right w:type="dxa" w:w="80"/>
+            </w:tcMar>
+          </w:tcPr>
+          <w:p>
+            <w:pPr>
+              <w:spacing w:after="0" w:line="240"/>
+            </w:pPr>
+            <w:r>
+              <w:rPr>
+                <w:rFonts w:ascii="Consolas" w:cs="Consolas" w:eastAsia="Consolas" w:hAnsi="Consolas"/>
+                <w:b w:val="false"/>
+                <w:bCs w:val="false"/>
+                <w:color w:val="333333"/>
+                <w:sz w:val="15"/>
+                <w:szCs w:val="15"/>
+              </w:rPr>
+              <w:t xml:space="preserve">results/scenario_results.md</w:t>
+            </w:r>
+            <w:r>
+              <w:rPr>
+                <w:rFonts w:ascii="Calibri" w:cs="Calibri" w:eastAsia="Calibri" w:hAnsi="Calibri"/>
+                <w:b w:val="false"/>
+                <w:bCs w:val="false"/>
+                <w:sz w:val="17"/>
+                <w:szCs w:val="17"/>
+              </w:rPr>
+              <w:t xml:space="preserve"> (+ </w:t>
+            </w:r>
+            <w:r>
+              <w:rPr>
+                <w:rFonts w:ascii="Consolas" w:cs="Consolas" w:eastAsia="Consolas" w:hAnsi="Consolas"/>
+                <w:b w:val="false"/>
+                <w:bCs w:val="false"/>
+                <w:color w:val="333333"/>
+                <w:sz w:val="15"/>
+                <w:szCs w:val="15"/>
+              </w:rPr>
+              <w:t xml:space="preserve">.csv</w:t>
+            </w:r>
+            <w:r>
+              <w:rPr>
+                <w:rFonts w:ascii="Calibri" w:cs="Calibri" w:eastAsia="Calibri" w:hAnsi="Calibri"/>
+                <w:b w:val="false"/>
+                <w:bCs w:val="false"/>
+                <w:sz w:val="17"/>
+                <w:szCs w:val="17"/>
+              </w:rPr>
+              <w:t xml:space="preserve">, </w:t>
+            </w:r>
+            <w:r>
+              <w:rPr>
+                <w:rFonts w:ascii="Consolas" w:cs="Consolas" w:eastAsia="Consolas" w:hAnsi="Consolas"/>
+                <w:b w:val="false"/>
+                <w:bCs w:val="false"/>
+                <w:color w:val="333333"/>
+                <w:sz w:val="15"/>
+                <w:szCs w:val="15"/>
+              </w:rPr>
+              <w:t xml:space="preserve">summary.json</w:t>
+            </w:r>
+            <w:r>
+              <w:rPr>
+                <w:rFonts w:ascii="Calibri" w:cs="Calibri" w:eastAsia="Calibri" w:hAnsi="Calibri"/>
+                <w:b w:val="false"/>
+                <w:bCs w:val="false"/>
+                <w:sz w:val="17"/>
+                <w:szCs w:val="17"/>
+              </w:rPr>
+              <w:t xml:space="preserve">)</w:t>
+            </w:r>
+          </w:p>
+        </w:tc>
+      </w:tr>
+      <w:tr>
+        <w:tc>
+          <w:tcPr>
+            <w:tcW w:type="dxa" w:w="4643"/>
+            <w:tcMar>
+              <w:top w:type="dxa" w:w="50"/>
+              <w:left w:type="dxa" w:w="80"/>
+              <w:bottom w:type="dxa" w:w="50"/>
+              <w:right w:type="dxa" w:w="80"/>
+            </w:tcMar>
+          </w:tcPr>
+          <w:p>
+            <w:pPr>
+              <w:spacing w:after="0" w:line="240"/>
+            </w:pPr>
+            <w:r>
+              <w:rPr>
+                <w:rFonts w:ascii="Calibri" w:cs="Calibri" w:eastAsia="Calibri" w:hAnsi="Calibri"/>
+                <w:b w:val="false"/>
+                <w:bCs w:val="false"/>
+                <w:sz w:val="17"/>
+                <w:szCs w:val="17"/>
+              </w:rPr>
+              <w:t xml:space="preserve">Per-run CLI transcripts, audit logs (</w:t>
+            </w:r>
+            <w:r>
+              <w:rPr>
+                <w:rFonts w:ascii="Consolas" w:cs="Consolas" w:eastAsia="Consolas" w:hAnsi="Consolas"/>
+                <w:b w:val="false"/>
+                <w:bCs w:val="false"/>
+                <w:color w:val="333333"/>
+                <w:sz w:val="15"/>
+                <w:szCs w:val="15"/>
+              </w:rPr>
+              <w:t xml:space="preserve">events.jsonl</w:t>
+            </w:r>
+            <w:r>
+              <w:rPr>
+                <w:rFonts w:ascii="Calibri" w:cs="Calibri" w:eastAsia="Calibri" w:hAnsi="Calibri"/>
+                <w:b w:val="false"/>
+                <w:bCs w:val="false"/>
+                <w:sz w:val="17"/>
+                <w:szCs w:val="17"/>
+              </w:rPr>
+              <w:t xml:space="preserve">), SQLite databases and snapshots, Excel/ICS/outbox exports</w:t>
+            </w:r>
+          </w:p>
+        </w:tc>
+        <w:tc>
+          <w:tcPr>
+            <w:tcW w:type="dxa" w:w="5103"/>
+            <w:tcMar>
+              <w:top w:type="dxa" w:w="50"/>
+              <w:left w:type="dxa" w:w="80"/>
+              <w:bottom w:type="dxa" w:w="50"/>
+              <w:right w:type="dxa" w:w="80"/>
+            </w:tcMar>
+          </w:tcPr>
+          <w:p>
+            <w:pPr>
+              <w:spacing w:after="0" w:line="240"/>
+            </w:pPr>
+            <w:r>
+              <w:rPr>
+                <w:rFonts w:ascii="Consolas" w:cs="Consolas" w:eastAsia="Consolas" w:hAnsi="Consolas"/>
+                <w:b w:val="false"/>
+                <w:bCs w:val="false"/>
+                <w:color w:val="333333"/>
+                <w:sz w:val="15"/>
+                <w:szCs w:val="15"/>
+              </w:rPr>
+              <w:t xml:space="preserve">results/runs/&lt;run&gt;/</w:t>
+            </w:r>
+          </w:p>
+        </w:tc>
+      </w:tr>
+      <w:tr>
+        <w:tc>
+          <w:tcPr>
+            <w:tcW w:type="dxa" w:w="4643"/>
+            <w:tcMar>
+              <w:top w:type="dxa" w:w="50"/>
+              <w:left w:type="dxa" w:w="80"/>
+              <w:bottom w:type="dxa" w:w="50"/>
+              <w:right w:type="dxa" w:w="80"/>
+            </w:tcMar>
+          </w:tcPr>
+          <w:p>
+            <w:pPr>
+              <w:spacing w:after="0" w:line="240"/>
+            </w:pPr>
+            <w:r>
+              <w:rPr>
+                <w:rFonts w:ascii="Calibri" w:cs="Calibri" w:eastAsia="Calibri" w:hAnsi="Calibri"/>
+                <w:b w:val="false"/>
+                <w:bCs w:val="false"/>
+                <w:sz w:val="17"/>
+                <w:szCs w:val="17"/>
+              </w:rPr>
+              <w:t xml:space="preserve">Decision stability across seeds</w:t>
+            </w:r>
+          </w:p>
+        </w:tc>
+        <w:tc>
+          <w:tcPr>
+            <w:tcW w:type="dxa" w:w="5103"/>
+            <w:tcMar>
+              <w:top w:type="dxa" w:w="50"/>
+              <w:left w:type="dxa" w:w="80"/>
+              <w:bottom w:type="dxa" w:w="50"/>
+              <w:right w:type="dxa" w:w="80"/>
+            </w:tcMar>
+          </w:tcPr>
+          <w:p>
+            <w:pPr>
+              <w:spacing w:after="0" w:line="240"/>
+            </w:pPr>
+            <w:r>
+              <w:rPr>
+                <w:rFonts w:ascii="Consolas" w:cs="Consolas" w:eastAsia="Consolas" w:hAnsi="Consolas"/>
+                <w:b w:val="false"/>
+                <w:bCs w:val="false"/>
+                <w:color w:val="333333"/>
+                <w:sz w:val="15"/>
+                <w:szCs w:val="15"/>
+              </w:rPr>
+              <w:t xml:space="preserve">results/decision_stability.md</w:t>
+            </w:r>
+          </w:p>
+        </w:tc>
+      </w:tr>
+      <w:tr>
+        <w:tc>
+          <w:tcPr>
+            <w:tcW w:type="dxa" w:w="4643"/>
+            <w:tcMar>
+              <w:top w:type="dxa" w:w="50"/>
+              <w:left w:type="dxa" w:w="80"/>
+              <w:bottom w:type="dxa" w:w="50"/>
+              <w:right w:type="dxa" w:w="80"/>
+            </w:tcMar>
+          </w:tcPr>
+          <w:p>
+            <w:pPr>
+              <w:spacing w:after="0" w:line="240"/>
+            </w:pPr>
+            <w:r>
+              <w:rPr>
+                <w:rFonts w:ascii="Calibri" w:cs="Calibri" w:eastAsia="Calibri" w:hAnsi="Calibri"/>
+                <w:b w:val="false"/>
+                <w:bCs w:val="false"/>
+                <w:sz w:val="17"/>
+                <w:szCs w:val="17"/>
+              </w:rPr>
+              <w:t xml:space="preserve">Live Gmail IMAP read</w:t>
+            </w:r>
+          </w:p>
+        </w:tc>
+        <w:tc>
+          <w:tcPr>
+            <w:tcW w:type="dxa" w:w="5103"/>
+            <w:tcMar>
+              <w:top w:type="dxa" w:w="50"/>
+              <w:left w:type="dxa" w:w="80"/>
+              <w:bottom w:type="dxa" w:w="50"/>
+              <w:right w:type="dxa" w:w="80"/>
+            </w:tcMar>
+          </w:tcPr>
+          <w:p>
+            <w:pPr>
+              <w:spacing w:after="0" w:line="240"/>
+            </w:pPr>
+            <w:r>
+              <w:rPr>
+                <w:rFonts w:ascii="Consolas" w:cs="Consolas" w:eastAsia="Consolas" w:hAnsi="Consolas"/>
+                <w:b w:val="false"/>
+                <w:bCs w:val="false"/>
+                <w:color w:val="333333"/>
+                <w:sz w:val="15"/>
+                <w:szCs w:val="15"/>
+              </w:rPr>
+              <w:t xml:space="preserve">results/live_imap_test.md</w:t>
+            </w:r>
+          </w:p>
+        </w:tc>
+      </w:tr>
+      <w:tr>
+        <w:tc>
+          <w:tcPr>
+            <w:tcW w:type="dxa" w:w="4643"/>
+            <w:tcMar>
+              <w:top w:type="dxa" w:w="50"/>
+              <w:left w:type="dxa" w:w="80"/>
+              <w:bottom w:type="dxa" w:w="50"/>
+              <w:right w:type="dxa" w:w="80"/>
+            </w:tcMar>
+          </w:tcPr>
+          <w:p>
+            <w:pPr>
+              <w:spacing w:after="0" w:line="240"/>
+            </w:pPr>
+            <w:r>
+              <w:rPr>
+                <w:rFonts w:ascii="Calibri" w:cs="Calibri" w:eastAsia="Calibri" w:hAnsi="Calibri"/>
+                <w:b w:val="false"/>
+                <w:bCs w:val="false"/>
+                <w:sz w:val="17"/>
+                <w:szCs w:val="17"/>
+              </w:rPr>
+              <w:t xml:space="preserve">SMTP delivery, allowlist block, no re-send</w:t>
+            </w:r>
+          </w:p>
+        </w:tc>
+        <w:tc>
+          <w:tcPr>
+            <w:tcW w:type="dxa" w:w="5103"/>
+            <w:tcMar>
+              <w:top w:type="dxa" w:w="50"/>
+              <w:left w:type="dxa" w:w="80"/>
+              <w:bottom w:type="dxa" w:w="50"/>
+              <w:right w:type="dxa" w:w="80"/>
+            </w:tcMar>
+          </w:tcPr>
+          <w:p>
+            <w:pPr>
+              <w:spacing w:after="0" w:line="240"/>
+            </w:pPr>
+            <w:r>
+              <w:rPr>
+                <w:rFonts w:ascii="Consolas" w:cs="Consolas" w:eastAsia="Consolas" w:hAnsi="Consolas"/>
+                <w:b w:val="false"/>
+                <w:bCs w:val="false"/>
+                <w:color w:val="333333"/>
+                <w:sz w:val="15"/>
+                <w:szCs w:val="15"/>
+              </w:rPr>
+              <w:t xml:space="preserve">results/smtp_local_test.txt</w:t>
+            </w:r>
+          </w:p>
+        </w:tc>
+      </w:tr>
+      <w:tr>
+        <w:tc>
+          <w:tcPr>
+            <w:tcW w:type="dxa" w:w="4643"/>
+            <w:tcMar>
+              <w:top w:type="dxa" w:w="50"/>
+              <w:left w:type="dxa" w:w="80"/>
+              <w:bottom w:type="dxa" w:w="50"/>
+              <w:right w:type="dxa" w:w="80"/>
+            </w:tcMar>
+          </w:tcPr>
+          <w:p>
+            <w:pPr>
+              <w:spacing w:after="0" w:line="240"/>
+            </w:pPr>
+            <w:r>
+              <w:rPr>
+                <w:rFonts w:ascii="Calibri" w:cs="Calibri" w:eastAsia="Calibri" w:hAnsi="Calibri"/>
+                <w:b w:val="false"/>
+                <w:bCs w:val="false"/>
+                <w:sz w:val="17"/>
+                <w:szCs w:val="17"/>
+              </w:rPr>
+              <w:t xml:space="preserve">Excel manual columns preserved on re-export</w:t>
+            </w:r>
+          </w:p>
+        </w:tc>
+        <w:tc>
+          <w:tcPr>
+            <w:tcW w:type="dxa" w:w="5103"/>
+            <w:tcMar>
+              <w:top w:type="dxa" w:w="50"/>
+              <w:left w:type="dxa" w:w="80"/>
+              <w:bottom w:type="dxa" w:w="50"/>
+              <w:right w:type="dxa" w:w="80"/>
+            </w:tcMar>
+          </w:tcPr>
+          <w:p>
+            <w:pPr>
+              <w:spacing w:after="0" w:line="240"/>
+            </w:pPr>
+            <w:r>
+              <w:rPr>
+                <w:rFonts w:ascii="Consolas" w:cs="Consolas" w:eastAsia="Consolas" w:hAnsi="Consolas"/>
+                <w:b w:val="false"/>
+                <w:bCs w:val="false"/>
+                <w:color w:val="333333"/>
+                <w:sz w:val="15"/>
+                <w:szCs w:val="15"/>
+              </w:rPr>
+              <w:t xml:space="preserve">results/excel_manual_columns_test.md</w:t>
+            </w:r>
+          </w:p>
+        </w:tc>
+      </w:tr>
+      <w:tr>
+        <w:tc>
+          <w:tcPr>
+            <w:tcW w:type="dxa" w:w="4643"/>
+            <w:tcMar>
+              <w:top w:type="dxa" w:w="50"/>
+              <w:left w:type="dxa" w:w="80"/>
+              <w:bottom w:type="dxa" w:w="50"/>
+              <w:right w:type="dxa" w:w="80"/>
+            </w:tcMar>
+          </w:tcPr>
+          <w:p>
+            <w:pPr>
+              <w:spacing w:after="0" w:line="240"/>
+            </w:pPr>
+            <w:r>
+              <w:rPr>
+                <w:rFonts w:ascii="Calibri" w:cs="Calibri" w:eastAsia="Calibri" w:hAnsi="Calibri"/>
+                <w:b w:val="false"/>
+                <w:bCs w:val="false"/>
+                <w:sz w:val="17"/>
+                <w:szCs w:val="17"/>
+              </w:rPr>
+              <w:t xml:space="preserve">Unit tests (dates, policy, injection, idempotency, isolation, versioning)</w:t>
+            </w:r>
+          </w:p>
+        </w:tc>
+        <w:tc>
+          <w:tcPr>
+            <w:tcW w:type="dxa" w:w="5103"/>
+            <w:tcMar>
+              <w:top w:type="dxa" w:w="50"/>
+              <w:left w:type="dxa" w:w="80"/>
+              <w:bottom w:type="dxa" w:w="50"/>
+              <w:right w:type="dxa" w:w="80"/>
+            </w:tcMar>
+          </w:tcPr>
+          <w:p>
+            <w:pPr>
+              <w:spacing w:after="0" w:line="240"/>
+            </w:pPr>
+            <w:r>
+              <w:rPr>
+                <w:rFonts w:ascii="Consolas" w:cs="Consolas" w:eastAsia="Consolas" w:hAnsi="Consolas"/>
+                <w:b w:val="false"/>
+                <w:bCs w:val="false"/>
+                <w:color w:val="333333"/>
+                <w:sz w:val="15"/>
+                <w:szCs w:val="15"/>
+              </w:rPr>
+              <w:t xml:space="preserve">tests/test_core.py</w:t>
+            </w:r>
+          </w:p>
+        </w:tc>
+      </w:tr>
+    </w:tbl>
+    <w:p>
+      <w:pPr>
+        <w:spacing w:after="80"/>
+      </w:pPr>
+    </w:p>
+    <w:p>
+      <w:pPr>
+        <w:pStyle w:val="Heading1"/>
+      </w:pPr>
+      <w:r>
+        <w:rPr>
+          <w:rFonts w:ascii="Calibri" w:cs="Calibri" w:eastAsia="Calibri" w:hAnsi="Calibri"/>
+          <w:b/>
+          <w:bCs/>
+          <w:color w:val="1F3864"/>
+          <w:sz w:val="28"/>
+          <w:szCs w:val="28"/>
+        </w:rPr>
+        <w:t xml:space="preserve">Appendix C: AI assistance and external code</w:t>
       </w:r>
     </w:p>
     <w:p>
@@ -6335,6 +7216,12 @@
   </w:num>
   <w:num w:numId="4">
     <w:abstractNumId w:val="2"/>
+    <w:lvlOverride w:ilvl="0">
+      <w:startOverride w:val="1"/>
+    </w:lvlOverride>
+  </w:num>
+  <w:num w:numId="5">
+    <w:abstractNumId w:val="3"/>
     <w:lvlOverride w:ilvl="0">
       <w:startOverride w:val="1"/>
     </w:lvlOverride>

</xml_diff>